<commit_message>
Improve ATC 2.1.7 documentation guides
</commit_message>
<xml_diff>
--- a/docs/docx/ATC_Full_User_Guide_EN.docx
+++ b/docs/docx/ATC_Full_User_Guide_EN.docx
@@ -11,11 +11,8 @@
       </w:r>
     </w:p>
     <w:p>
-      <w:pPr>
-        <w:pStyle w:val="Heading1"/>
-      </w:pPr>
-      <w:r>
-        <w:t>Advanced Trigonometry Calculator Full User Guide</w:t>
+      <w:r>
+        <w:t>﻿# Advanced Trigonometry Calculator Full User Guide</w:t>
       </w:r>
     </w:p>
     <w:p>
@@ -252,7 +249,180 @@
         <w:pStyle w:val="Heading2"/>
       </w:pPr>
       <w:r>
-        <w:t>3. Input basics</w:t>
+        <w:t>3. Quick Start</w:t>
+      </w:r>
+    </w:p>
+    <w:p>
+      <w:r>
+        <w:t>ATC is a free, open-source Windows command-line mathematical application. It</w:t>
+      </w:r>
+    </w:p>
+    <w:p>
+      <w:r>
+        <w:t>evaluates typed mathematical expressions, documented commands and guided</w:t>
+      </w:r>
+    </w:p>
+    <w:p>
+      <w:r>
+        <w:t>workflows. It is best understood as a practical local calculator, not as a</w:t>
+      </w:r>
+    </w:p>
+    <w:p>
+      <w:r>
+        <w:t>universal symbolic CAS.</w:t>
+      </w:r>
+    </w:p>
+    <w:p>
+      <w:r>
+        <w:t>Open ATC by launching atc.exe from the built Release folder or through the</w:t>
+      </w:r>
+    </w:p>
+    <w:p>
+      <w:r>
+        <w:t>installed ATC shortcut/launcher when available. The prompt accepts one command</w:t>
+      </w:r>
+    </w:p>
+    <w:p>
+      <w:r>
+        <w:t>or expression per line.</w:t>
+      </w:r>
+    </w:p>
+    <w:p>
+      <w:r>
+        <w:t>First commands to try:</w:t>
+      </w:r>
+    </w:p>
+    <w:p>
+      <w:pPr>
+        <w:pStyle w:val="NoSpacing"/>
+      </w:pPr>
+      <w:r>
+        <w:rPr>
+          <w:rFonts w:ascii="Consolas" w:hAnsi="Consolas"/>
+          <w:sz w:val="18"/>
+        </w:rPr>
+        <w:t>2+2</w:t>
+        <w:br/>
+        <w:t>sin(pi/2)</w:t>
+        <w:br/>
+        <w:t>mode</w:t>
+        <w:br/>
+        <w:t>solve equation(x^2-5*x+6)</w:t>
+        <w:br/>
+        <w:t>solver(x+2)</w:t>
+        <w:br/>
+        <w:t>create matrix(foo\2\2\3)</w:t>
+        <w:br/>
+        <w:t>see variables</w:t>
+        <w:br/>
+        <w:t>exit</w:t>
+      </w:r>
+    </w:p>
+    <w:p>
+      <w:r>
+        <w:t>Basic reading rules:</w:t>
+      </w:r>
+    </w:p>
+    <w:p>
+      <w:pPr>
+        <w:pStyle w:val="ListBullet"/>
+      </w:pPr>
+      <w:r>
+        <w:t>_ is used by ATC as a negative marker in many documented command forms and</w:t>
+      </w:r>
+    </w:p>
+    <w:p>
+      <w:r>
+        <w:t xml:space="preserve">  outputs, for example _5 means -5.</w:t>
+      </w:r>
+    </w:p>
+    <w:p>
+      <w:pPr>
+        <w:pStyle w:val="ListBullet"/>
+      </w:pPr>
+      <w:r>
+        <w:t>#0, #1, and later indexes refer to previous results in the current</w:t>
+      </w:r>
+    </w:p>
+    <w:p>
+      <w:r>
+        <w:t xml:space="preserve">  session.</w:t>
+      </w:r>
+    </w:p>
+    <w:p>
+      <w:pPr>
+        <w:pStyle w:val="ListBullet"/>
+      </w:pPr>
+      <w:r>
+        <w:t>A direct expression is evaluated immediately, such as 2+2.</w:t>
+      </w:r>
+    </w:p>
+    <w:p>
+      <w:pPr>
+        <w:pStyle w:val="ListBullet"/>
+      </w:pPr>
+      <w:r>
+        <w:t>A command starts a named ATC action, such as mode or solve equation(...).</w:t>
+      </w:r>
+    </w:p>
+    <w:p>
+      <w:pPr>
+        <w:pStyle w:val="ListBullet"/>
+      </w:pPr>
+      <w:r>
+        <w:t>A guided module opens an interactive workflow, such as `financial</w:t>
+      </w:r>
+    </w:p>
+    <w:p>
+      <w:r>
+        <w:t xml:space="preserve">  calculations or unit conversions`.</w:t>
+      </w:r>
+    </w:p>
+    <w:p>
+      <w:r>
+        <w:t>Recommended first workflow:</w:t>
+      </w:r>
+    </w:p>
+    <w:p>
+      <w:pPr>
+        <w:pStyle w:val="NoSpacing"/>
+      </w:pPr>
+      <w:r>
+        <w:rPr>
+          <w:rFonts w:ascii="Consolas" w:hAnsi="Consolas"/>
+          <w:sz w:val="18"/>
+        </w:rPr>
+        <w:t>mode</w:t>
+        <w:br/>
+        <w:t>2+2</w:t>
+        <w:br/>
+        <w:t>sin(pi/2)</w:t>
+        <w:br/>
+        <w:t>solve equation(x^2-5*x+6)</w:t>
+        <w:br/>
+        <w:t>verbose resolution(1)</w:t>
+        <w:br/>
+        <w:t>sin(pi/6)</w:t>
+        <w:br/>
+        <w:t>verbose resolution(0)</w:t>
+      </w:r>
+    </w:p>
+    <w:p>
+      <w:r>
+        <w:t>If a result matters, confirm the angle mode and precision mode before relying</w:t>
+      </w:r>
+    </w:p>
+    <w:p>
+      <w:r>
+        <w:t>on it.</w:t>
+      </w:r>
+    </w:p>
+    <w:p>
+      <w:pPr>
+        <w:pStyle w:val="Heading2"/>
+      </w:pPr>
+      <w:r>
+        <w:t>4. Input basics</w:t>
       </w:r>
     </w:p>
     <w:p>
@@ -359,7 +529,7 @@
         <w:pStyle w:val="Heading2"/>
       </w:pPr>
       <w:r>
-        <w:t>4. Interactive prompt</w:t>
+        <w:t>5. Interactive prompt</w:t>
       </w:r>
     </w:p>
     <w:p>
@@ -424,7 +594,7 @@
         <w:pStyle w:val="Heading2"/>
       </w:pPr>
       <w:r>
-        <w:t>5. Angle mode</w:t>
+        <w:t>6. Angle mode</w:t>
       </w:r>
     </w:p>
     <w:p>
@@ -494,7 +664,7 @@
         <w:pStyle w:val="Heading2"/>
       </w:pPr>
       <w:r>
-        <w:t>6. Precision</w:t>
+        <w:t>7. Precision</w:t>
       </w:r>
     </w:p>
     <w:p>
@@ -604,7 +774,7 @@
         <w:pStyle w:val="Heading2"/>
       </w:pPr>
       <w:r>
-        <w:t>7. Constants and previous answers</w:t>
+        <w:t>8. Constants and previous answers</w:t>
       </w:r>
     </w:p>
     <w:p>
@@ -665,7 +835,7 @@
         <w:pStyle w:val="Heading2"/>
       </w:pPr>
       <w:r>
-        <w:t>8. Arithmetic</w:t>
+        <w:t>9. Arithmetic</w:t>
       </w:r>
     </w:p>
     <w:p>
@@ -733,7 +903,7 @@
         <w:pStyle w:val="Heading2"/>
       </w:pPr>
       <w:r>
-        <w:t>9. Trigonometry</w:t>
+        <w:t>10. Trigonometry</w:t>
       </w:r>
     </w:p>
     <w:p>
@@ -816,7 +986,7 @@
         <w:pStyle w:val="Heading2"/>
       </w:pPr>
       <w:r>
-        <w:t>10. Hyperbolic functions</w:t>
+        <w:t>11. Hyperbolic functions</w:t>
       </w:r>
     </w:p>
     <w:p>
@@ -873,7 +1043,7 @@
         <w:pStyle w:val="Heading2"/>
       </w:pPr>
       <w:r>
-        <w:t>11. Logarithms</w:t>
+        <w:t>12. Logarithms</w:t>
       </w:r>
     </w:p>
     <w:p>
@@ -923,7 +1093,7 @@
         <w:pStyle w:val="Heading2"/>
       </w:pPr>
       <w:r>
-        <w:t>12. Complex numbers</w:t>
+        <w:t>13. Complex numbers</w:t>
       </w:r>
     </w:p>
     <w:p>
@@ -969,7 +1139,7 @@
         <w:pStyle w:val="Heading2"/>
       </w:pPr>
       <w:r>
-        <w:t>13. Automatic multiplication</w:t>
+        <w:t>14. Automatic multiplication</w:t>
       </w:r>
     </w:p>
     <w:p>
@@ -1056,7 +1226,7 @@
         <w:pStyle w:val="Heading2"/>
       </w:pPr>
       <w:r>
-        <w:t>14. Variables</w:t>
+        <w:t>15. Variables</w:t>
       </w:r>
     </w:p>
     <w:p>
@@ -1122,7 +1292,7 @@
         <w:pStyle w:val="Heading2"/>
       </w:pPr>
       <w:r>
-        <w:t>15. Matrices</w:t>
+        <w:t>16. Matrices</w:t>
       </w:r>
     </w:p>
     <w:p>
@@ -1217,7 +1387,7 @@
         <w:pStyle w:val="Heading2"/>
       </w:pPr>
       <w:r>
-        <w:t>16. Statistics and probability</w:t>
+        <w:t>17. Statistics and probability</w:t>
       </w:r>
     </w:p>
     <w:p>
@@ -1321,7 +1491,7 @@
         <w:pStyle w:val="Heading2"/>
       </w:pPr>
       <w:r>
-        <w:t>17. DSP</w:t>
+        <w:t>18. DSP</w:t>
       </w:r>
     </w:p>
     <w:p>
@@ -1366,7 +1536,7 @@
         <w:pStyle w:val="Heading2"/>
       </w:pPr>
       <w:r>
-        <w:t>18. Polynomial tools</w:t>
+        <w:t>19. Polynomial tools</w:t>
       </w:r>
     </w:p>
     <w:p>
@@ -1453,7 +1623,7 @@
         <w:pStyle w:val="Heading2"/>
       </w:pPr>
       <w:r>
-        <w:t>19. Equation solving</w:t>
+        <w:t>20. Equation solving</w:t>
       </w:r>
     </w:p>
     <w:p>
@@ -1554,7 +1724,7 @@
         <w:pStyle w:val="Heading2"/>
       </w:pPr>
       <w:r>
-        <w:t>20. Solver</w:t>
+        <w:t>21. Solver</w:t>
       </w:r>
     </w:p>
     <w:p>
@@ -1617,7 +1787,7 @@
         <w:pStyle w:val="Heading2"/>
       </w:pPr>
       <w:r>
-        <w:t>21. Function study</w:t>
+        <w:t>22. Function study</w:t>
       </w:r>
     </w:p>
     <w:p>
@@ -1668,7 +1838,7 @@
         <w:pStyle w:val="Heading2"/>
       </w:pPr>
       <w:r>
-        <w:t>22. Graph</w:t>
+        <w:t>23. Graph</w:t>
       </w:r>
     </w:p>
     <w:p>
@@ -1712,7 +1882,7 @@
         <w:pStyle w:val="Heading2"/>
       </w:pPr>
       <w:r>
-        <w:t>23. Guided calculation modules</w:t>
+        <w:t>24. Guided calculation modules</w:t>
       </w:r>
     </w:p>
     <w:p>
@@ -1761,7 +1931,7 @@
         <w:pStyle w:val="Heading2"/>
       </w:pPr>
       <w:r>
-        <w:t>24. Financial, geometry, physics and unit conversion recipes</w:t>
+        <w:t>25. Financial, geometry, physics and unit conversion recipes</w:t>
       </w:r>
     </w:p>
     <w:p>
@@ -1866,7 +2036,7 @@
         <w:pStyle w:val="Heading2"/>
       </w:pPr>
       <w:r>
-        <w:t>25. Time commands</w:t>
+        <w:t>26. Time commands</w:t>
       </w:r>
     </w:p>
     <w:p>
@@ -1916,7 +2086,7 @@
         <w:pStyle w:val="Heading2"/>
       </w:pPr>
       <w:r>
-        <w:t>26. Sorting</w:t>
+        <w:t>27. Sorting</w:t>
       </w:r>
     </w:p>
     <w:p>
@@ -1971,7 +2141,7 @@
         <w:pStyle w:val="Heading2"/>
       </w:pPr>
       <w:r>
-        <w:t>27. TXT processing and command bridge</w:t>
+        <w:t>28. TXT processing and command bridge</w:t>
       </w:r>
     </w:p>
     <w:p>
@@ -2078,7 +2248,7 @@
         <w:pStyle w:val="Heading2"/>
       </w:pPr>
       <w:r>
-        <w:t>28. Scripting</w:t>
+        <w:t>29. Scripting</w:t>
       </w:r>
     </w:p>
     <w:p>
@@ -2161,7 +2331,7 @@
         <w:pStyle w:val="Heading2"/>
       </w:pPr>
       <w:r>
-        <w:t>29. User functions</w:t>
+        <w:t>30. User functions</w:t>
       </w:r>
     </w:p>
     <w:p>
@@ -2184,7 +2354,7 @@
         <w:pStyle w:val="Heading2"/>
       </w:pPr>
       <w:r>
-        <w:t>30. Settings and environment commands</w:t>
+        <w:t>31. Settings and environment commands</w:t>
       </w:r>
     </w:p>
     <w:p>
@@ -2244,7 +2414,7 @@
         <w:pStyle w:val="Heading2"/>
       </w:pPr>
       <w:r>
-        <w:t>31. File and folder commands</w:t>
+        <w:t>32. File and folder commands</w:t>
       </w:r>
     </w:p>
     <w:p>
@@ -2315,7 +2485,7 @@
         <w:pStyle w:val="Heading2"/>
       </w:pPr>
       <w:r>
-        <w:t>32. Export prompts</w:t>
+        <w:t>33. Export prompts</w:t>
       </w:r>
     </w:p>
     <w:p>
@@ -2379,7 +2549,7 @@
         <w:pStyle w:val="Heading2"/>
       </w:pPr>
       <w:r>
-        <w:t>33. Verbose resolution</w:t>
+        <w:t>34. Verbose resolution</w:t>
       </w:r>
     </w:p>
     <w:p>
@@ -2431,7 +2601,47 @@
         <w:pStyle w:val="Heading2"/>
       </w:pPr>
       <w:r>
-        <w:t>34. Recipes / Usage profiles</w:t>
+        <w:t>35. Cookbook / Recipes</w:t>
+      </w:r>
+    </w:p>
+    <w:p>
+      <w:r>
+        <w:t>The dedicated cookbook is available at:</w:t>
+      </w:r>
+    </w:p>
+    <w:p>
+      <w:pPr>
+        <w:pStyle w:val="NoSpacing"/>
+      </w:pPr>
+      <w:r>
+        <w:rPr>
+          <w:rFonts w:ascii="Consolas" w:hAnsi="Consolas"/>
+          <w:sz w:val="18"/>
+        </w:rPr>
+        <w:t>docs/en/ATC_Cookbook.md</w:t>
+      </w:r>
+    </w:p>
+    <w:p>
+      <w:r>
+        <w:t>It contains practical workflows for scientific calculations, trigonometry,</w:t>
+      </w:r>
+    </w:p>
+    <w:p>
+      <w:r>
+        <w:t>polynomial solving, matrices, statistics, DSP, TXT processing, verbose</w:t>
+      </w:r>
+    </w:p>
+    <w:p>
+      <w:r>
+        <w:t>resolution and guided modules.</w:t>
+      </w:r>
+    </w:p>
+    <w:p>
+      <w:pPr>
+        <w:pStyle w:val="Heading2"/>
+      </w:pPr>
+      <w:r>
+        <w:t>36. Recipes / Usage profiles</w:t>
       </w:r>
     </w:p>
     <w:p>
@@ -2571,7 +2781,47 @@
         <w:pStyle w:val="Heading2"/>
       </w:pPr>
       <w:r>
-        <w:t>35. Practical troubleshooting</w:t>
+        <w:t>37. Best practices</w:t>
+      </w:r>
+    </w:p>
+    <w:p>
+      <w:r>
+        <w:t>The dedicated best-practices guide is available at:</w:t>
+      </w:r>
+    </w:p>
+    <w:p>
+      <w:pPr>
+        <w:pStyle w:val="NoSpacing"/>
+      </w:pPr>
+      <w:r>
+        <w:rPr>
+          <w:rFonts w:ascii="Consolas" w:hAnsi="Consolas"/>
+          <w:sz w:val="18"/>
+        </w:rPr>
+        <w:t>docs/en/Best_Practices.md</w:t>
+      </w:r>
+    </w:p>
+    <w:p>
+      <w:r>
+        <w:t>Use it for reliable day-to-day workflows: start with small expressions,</w:t>
+      </w:r>
+    </w:p>
+    <w:p>
+      <w:r>
+        <w:t>confirm angle mode, validate parentheses, choose the right solver path, use TXT</w:t>
+      </w:r>
+    </w:p>
+    <w:p>
+      <w:r>
+        <w:t>files for repeatable batches and avoid undocumented behavior.</w:t>
+      </w:r>
+    </w:p>
+    <w:p>
+      <w:pPr>
+        <w:pStyle w:val="Heading2"/>
+      </w:pPr>
+      <w:r>
+        <w:t>38. Practical troubleshooting</w:t>
       </w:r>
     </w:p>
     <w:p>
@@ -2640,7 +2890,7 @@
         <w:pStyle w:val="Heading2"/>
       </w:pPr>
       <w:r>
-        <w:t>36. Documentation and test coverage</w:t>
+        <w:t>39. Documentation and test coverage</w:t>
       </w:r>
     </w:p>
     <w:p>

</xml_diff>